<commit_message>
Fix ODE solver convergence at high temperature; re-run sensitivity analysis
Root cause - default maxSteps (2000) insufficient for stiff ODEs under extreme evaporation (high T + moderate RH). Droplet mass approaching zero forces very small solver steps, exhausting the step budget.

run_sensitivity.py - set maxSteps=20000 in load_base_config(). sensitivity-analysis.qmd - replaced Model Limitations section with Solver Configuration for Extreme Conditions documenting root cause, fix, and alternatives. Updated conclusion 5. Re-ran full analysis, all parameter combinations now converge. .gitignore - added __pycache__/ and sensitivity PDF, removed cached pyc.
</commit_message>
<xml_diff>
--- a/sensitivity/sensitivity-analysis.docx
+++ b/sensitivity/sensitivity-analysis.docx
@@ -20,7 +20,7 @@
         <w:pStyle w:val="Date"/>
       </w:pPr>
       <w:r>
-        <w:t xml:space="preserve">2026-04-24</w:t>
+        <w:t xml:space="preserve">2026-04-26</w:t>
       </w:r>
     </w:p>
     <w:sdt>
@@ -2639,13 +2639,13 @@
       </w:r>
     </w:p>
     <w:bookmarkEnd w:id="58"/>
-    <w:bookmarkStart w:id="59" w:name="model-limitations-identified"/>
+    <w:bookmarkStart w:id="59" w:name="X4a550bb968ebeed018b79c5fe69956b2889c15d"/>
     <w:p>
       <w:pPr>
         <w:pStyle w:val="Heading3"/>
       </w:pPr>
       <w:r>
-        <w:t xml:space="preserve">4.2 Model Limitations Identified</w:t>
+        <w:t xml:space="preserve">4.2 Solver Configuration for Extreme Conditions</w:t>
       </w:r>
     </w:p>
     <w:p>
@@ -2653,7 +2653,77 @@
         <w:pStyle w:val="FirstParagraph"/>
       </w:pPr>
       <w:r>
-        <w:t xml:space="preserve">During the analysis, the model failed to converge at the high temperature extreme (26.6 °C) due to ODE solver step limits being exceeded. This occurs because rapid evaporation at high temperature and moderate humidity creates stiff differential equations as droplet mass approaches zero. This represents a practical limitation for simulations under hot, dry conditions and may warrant investigation of adaptive solver parameters or regularisation of the evaporation equations.</w:t>
+        <w:t xml:space="preserve">Initial runs with the default solver configuration (</w:t>
+      </w:r>
+      <w:r>
+        <w:rPr>
+          <w:rStyle w:val="VerbatimChar"/>
+        </w:rPr>
+        <w:t xml:space="preserve">maxSteps: 2000</w:t>
+      </w:r>
+      <w:r>
+        <w:t xml:space="preserve">) failed to converge at the high temperature extreme (26.6 °C). The root cause is equation stiffness: at high temperature and moderate humidity the saturation deficit is large, driving rapid evaporation that shrinks droplets toward zero mass. As droplet mass decreases, the evaporation and drag terms change on increasingly short timescales, forcing the CVODE BDF solver to take very small internal steps. With</w:t>
+      </w:r>
+      <w:r>
+        <w:t xml:space="preserve"> </w:t>
+      </w:r>
+      <w:r>
+        <w:rPr>
+          <w:rStyle w:val="VerbatimChar"/>
+        </w:rPr>
+        <w:t xml:space="preserve">maxSteps: 2000</w:t>
+      </w:r>
+      <w:r>
+        <w:t xml:space="preserve"> </w:t>
+      </w:r>
+      <w:r>
+        <w:t xml:space="preserve">the solver exhausts its step budget before completing the integration interval.</w:t>
+      </w:r>
+    </w:p>
+    <w:p>
+      <w:pPr>
+        <w:pStyle w:val="BodyText"/>
+      </w:pPr>
+      <w:r>
+        <w:t xml:space="preserve">The fix is straightforward: increasing</w:t>
+      </w:r>
+      <w:r>
+        <w:t xml:space="preserve"> </w:t>
+      </w:r>
+      <w:r>
+        <w:rPr>
+          <w:rStyle w:val="VerbatimChar"/>
+        </w:rPr>
+        <w:t xml:space="preserve">maxSteps</w:t>
+      </w:r>
+      <w:r>
+        <w:t xml:space="preserve"> </w:t>
+      </w:r>
+      <w:r>
+        <w:t xml:space="preserve">to 20 000 allows the solver to resolve the stiff transition without any loss of accuracy. Well-behaved parameter combinations continue to use far fewer steps, so there is no appreciable computational penalty. Alternatively, the convergence issue can be avoided by choosing parameter combinations that reduce the saturation deficit (e.g. higher relative humidity ≥ 85% at 26.6 °C, or temperatures ≤ ~22 °C at the baseline humidity of 67.1%).</w:t>
+      </w:r>
+    </w:p>
+    <w:p>
+      <w:pPr>
+        <w:pStyle w:val="BodyText"/>
+      </w:pPr>
+      <w:r>
+        <w:t xml:space="preserve">For production use of CDM under hot, dry conditions, users should set</w:t>
+      </w:r>
+      <w:r>
+        <w:t xml:space="preserve"> </w:t>
+      </w:r>
+      <w:r>
+        <w:rPr>
+          <w:rStyle w:val="VerbatimChar"/>
+        </w:rPr>
+        <w:t xml:space="preserve">maxSteps</w:t>
+      </w:r>
+      <w:r>
+        <w:t xml:space="preserve"> </w:t>
+      </w:r>
+      <w:r>
+        <w:t xml:space="preserve">to at least 20 000 in the integration options. Future model versions may benefit from adaptive step-limit heuristics or regularisation of the evaporation equations near zero droplet mass.</w:t>
       </w:r>
     </w:p>
     <w:bookmarkEnd w:id="59"/>
@@ -2892,7 +2962,16 @@
         </w:numPr>
       </w:pPr>
       <w:r>
-        <w:t xml:space="preserve">The model exhibits convergence limitations under extreme evaporation conditions (high temperature, moderate humidity) that should be documented as a boundary condition for model applicability.</w:t>
+        <w:t xml:space="preserve">The default solver step limit (</w:t>
+      </w:r>
+      <w:r>
+        <w:rPr>
+          <w:rStyle w:val="VerbatimChar"/>
+        </w:rPr>
+        <w:t xml:space="preserve">maxSteps: 2000</w:t>
+      </w:r>
+      <w:r>
+        <w:t xml:space="preserve">) is insufficient under extreme evaporation conditions; increasing it to 20 000 resolves convergence at all tested parameter combinations without computational penalty.</w:t>
       </w:r>
     </w:p>
     <w:bookmarkEnd w:id="63"/>

</xml_diff>